<commit_message>
Keep the Supplementary Methods within five pages
Co-Authored-By: Claude Opus 5.5 <noreply@anthropic.com>
Claude-Session: https://claude.ai/code/session_01TiAKffYKtUstdRZFkwtJA9
</commit_message>
<xml_diff>
--- a/submission/candidate_20261011_review/Supplementary_Material.docx
+++ b/submission/candidate_20261011_review/Supplementary_Material.docx
@@ -290,7 +290,7 @@
         <w:rPr>
           <w:color w:val="000000"/>
         </w:rPr>
-        <w:t xml:space="preserve">instruments, MR-Egger and weighted-mode estimates are imprecise, and the MR-Egger intercept test has little power to detect directional pleiotropy.</w:t>
+        <w:t xml:space="preserve">instruments, these estimators had little power.</w:t>
       </w:r>
     </w:p>
     <w:p>
@@ -1691,7 +1691,7 @@
         <w:rPr>
           <w:color w:val="000000"/>
         </w:rPr>
-        <w:t xml:space="preserve">The workbook holds exported full-precision outputs, described in its Readme and Column_dictionary sheets; reproduction validates implementation, not instrument validity or causal assumptions.</w:t>
+        <w:t xml:space="preserve">The workbook Readme and Column_dictionary sheets describe every sheet; reproduction validates implementation, not causal assumptions.</w:t>
       </w:r>
     </w:p>
     <w:bookmarkEnd w:id="27"/>

</xml_diff>